<commit_message>
Corregir enlaces de la portada a sintaxis HTML
</commit_message>
<xml_diff>
--- a/AlanGarcia_2025-1403_Laboratorio_RemoteApp_RADIUS.docx
+++ b/AlanGarcia_2025-1403_Laboratorio_RemoteApp_RADIUS.docx
@@ -1,8 +1,8 @@
 
 <file path=word/document.xml><?xml version="1.0" encoding="utf-8"?>
-<w:document xmlns:ns3="http://schemas.openxmlformats.org/drawingml/2006/main" xmlns:ns4="http://schemas.openxmlformats.org/drawingml/2006/picture" xmlns:r="http://schemas.openxmlformats.org/officeDocument/2006/relationships" xmlns:w="http://schemas.openxmlformats.org/wordprocessingml/2006/main" xmlns:wp="http://schemas.openxmlformats.org/drawingml/2006/wordprocessingDrawing">
+<w:document xmlns:ns2="http://schemas.openxmlformats.org/drawingml/2006/main" xmlns:ns3="http://schemas.openxmlformats.org/drawingml/2006/picture" xmlns:r="http://schemas.openxmlformats.org/officeDocument/2006/relationships" xmlns:w="http://schemas.openxmlformats.org/wordprocessingml/2006/main" xmlns:wp="http://schemas.openxmlformats.org/drawingml/2006/wordprocessingDrawing">
   <w:body>
-    <w:bookmarkStart w:id="92" w:name="X363c3e393e59738286efd9ffe2c5c7958fd6daf"/>
+    <w:bookmarkStart w:id="90" w:name="X363c3e393e59738286efd9ffe2c5c7958fd6daf"/>
     <w:p>
       <w:pPr>
         <w:pStyle w:val="Heading1"/>
@@ -133,14 +133,9 @@
       <w:r>
         <w:t xml:space="preserve"> </w:t>
       </w:r>
-      <w:hyperlink r:id="rId9">
-        <w:r>
-          <w:rPr>
-            <w:rStyle w:val="Hyperlink"/>
-          </w:rPr>
-          <w:t xml:space="preserve">https://youtu.be/s9imWZqL1VQ</w:t>
-        </w:r>
-      </w:hyperlink>
+      <w:r>
+        <w:t xml:space="preserve">https://youtu.be/s9imWZqL1VQ</w:t>
+      </w:r>
     </w:p>
     <w:p>
       <w:pPr>
@@ -152,21 +147,16 @@
       <w:r>
         <w:t xml:space="preserve"> </w:t>
       </w:r>
-      <w:hyperlink r:id="rId10">
-        <w:r>
-          <w:rPr>
-            <w:rStyle w:val="Hyperlink"/>
-          </w:rPr>
-          <w:t xml:space="preserve">https://github.com/imAlanG16/TSI-203_Semana_9_RemoteApp_RADIUS</w:t>
-        </w:r>
-      </w:hyperlink>
+      <w:r>
+        <w:t xml:space="preserve">https://github.com/imAlanG16/TSI-203_Semana_9_RemoteApp_RADIUS</w:t>
+      </w:r>
     </w:p>
     <w:p>
       <w:r>
         <w:br w:type="page"/>
       </w:r>
     </w:p>
-    <w:bookmarkStart w:id="11" w:name="introducción"/>
+    <w:bookmarkStart w:id="9" w:name="introducción"/>
     <w:p>
       <w:pPr>
         <w:pStyle w:val="Heading2"/>
@@ -185,8 +175,8 @@
         <w:t xml:space="preserve">El presente informe técnico describe la implementación de una infraestructura de acceso seguro y control de administración basada en Windows Server 2016 y equipos de comunicaciones Cisco. El objetivo de este laboratorio es doble: en primer lugar, implementar la virtualización de aplicaciones a través de Microsoft Remote Desktop Services (RDS) en las modalidades clásica de RemoteApp y cliente web moderno basado en HTML5 (RemoteApp Web Client), alojando y publicando una intranet corporativa personalizada bajo el servidor web IIS. En segundo lugar, establecer un control de acceso centralizado para la administración de la red (AAA) utilizando Network Policy Server (NPS) como servidor RADIUS, el cual discrimina los privilegios de los administradores en función de grupos de Active Directory para otorgar accesos diferenciados (Privilegio 15 y Privilegio 1) sobre las terminales de red administradas.</w:t>
       </w:r>
     </w:p>
-    <w:bookmarkEnd w:id="11"/>
-    <w:bookmarkStart w:id="15" w:name="Xff8d82e30a2656d88046faded2ea03ad53cd622"/>
+    <w:bookmarkEnd w:id="9"/>
+    <w:bookmarkStart w:id="13" w:name="Xff8d82e30a2656d88046faded2ea03ad53cd622"/>
     <w:p>
       <w:pPr>
         <w:pStyle w:val="Heading2"/>
@@ -376,40 +366,40 @@
           <wp:inline>
             <wp:extent cx="5334000" cy="3934515"/>
             <wp:effectExtent b="0" l="0" r="0" t="0"/>
-            <wp:docPr descr="Topología del Laboratorio" title="" id="13" name="Picture"/>
-            <ns3:graphic>
-              <ns3:graphicData uri="http://schemas.openxmlformats.org/drawingml/2006/picture">
-                <ns4:pic>
-                  <ns4:nvPicPr>
-                    <ns4:cNvPr descr="images/01_topologia_red.png" id="14" name="Picture"/>
-                    <ns4:cNvPicPr>
-                      <ns3:picLocks noChangeArrowheads="1" noChangeAspect="1"/>
-                    </ns4:cNvPicPr>
-                  </ns4:nvPicPr>
-                  <ns4:blipFill>
-                    <ns3:blip r:embed="rId12"/>
-                    <ns3:stretch>
-                      <ns3:fillRect/>
-                    </ns3:stretch>
-                  </ns4:blipFill>
-                  <ns4:spPr bwMode="auto">
-                    <ns3:xfrm>
-                      <ns3:off x="0" y="0"/>
-                      <ns3:ext cx="5334000" cy="3934515"/>
-                    </ns3:xfrm>
-                    <ns3:prstGeom prst="rect">
-                      <ns3:avLst/>
-                    </ns3:prstGeom>
-                    <ns3:noFill/>
-                    <ns3:ln w="9525">
-                      <ns3:noFill/>
-                      <ns3:headEnd/>
-                      <ns3:tailEnd/>
-                    </ns3:ln>
-                  </ns4:spPr>
-                </ns4:pic>
-              </ns3:graphicData>
-            </ns3:graphic>
+            <wp:docPr descr="Topología del Laboratorio" title="" id="11" name="Picture"/>
+            <ns2:graphic>
+              <ns2:graphicData uri="http://schemas.openxmlformats.org/drawingml/2006/picture">
+                <ns3:pic>
+                  <ns3:nvPicPr>
+                    <ns3:cNvPr descr="images/01_topologia_red.png" id="12" name="Picture"/>
+                    <ns3:cNvPicPr>
+                      <ns2:picLocks noChangeArrowheads="1" noChangeAspect="1"/>
+                    </ns3:cNvPicPr>
+                  </ns3:nvPicPr>
+                  <ns3:blipFill>
+                    <ns2:blip r:embed="rId10"/>
+                    <ns2:stretch>
+                      <ns2:fillRect/>
+                    </ns2:stretch>
+                  </ns3:blipFill>
+                  <ns3:spPr bwMode="auto">
+                    <ns2:xfrm>
+                      <ns2:off x="0" y="0"/>
+                      <ns2:ext cx="5334000" cy="3934515"/>
+                    </ns2:xfrm>
+                    <ns2:prstGeom prst="rect">
+                      <ns2:avLst/>
+                    </ns2:prstGeom>
+                    <ns2:noFill/>
+                    <ns2:ln w="9525">
+                      <ns2:noFill/>
+                      <ns2:headEnd/>
+                      <ns2:tailEnd/>
+                    </ns2:ln>
+                  </ns3:spPr>
+                </ns3:pic>
+              </ns2:graphicData>
+            </ns2:graphic>
           </wp:inline>
         </w:drawing>
       </w:r>
@@ -925,8 +915,8 @@
         </w:tc>
       </w:tr>
     </w:tbl>
-    <w:bookmarkEnd w:id="15"/>
-    <w:bookmarkStart w:id="32" w:name="Xf2568b4cc0653378a9a22aefb8080f84ea317ac"/>
+    <w:bookmarkEnd w:id="13"/>
+    <w:bookmarkStart w:id="30" w:name="Xf2568b4cc0653378a9a22aefb8080f84ea317ac"/>
     <w:p>
       <w:pPr>
         <w:pStyle w:val="Heading2"/>
@@ -937,7 +927,7 @@
         <w:t xml:space="preserve">3. Configuración de Windows Server 2016 en Adelante</w:t>
       </w:r>
     </w:p>
-    <w:bookmarkStart w:id="19" w:name="Xe4ac021ec14b01998057d7142086d6f0ccf2f42"/>
+    <w:bookmarkStart w:id="17" w:name="Xe4ac021ec14b01998057d7142086d6f0ccf2f42"/>
     <w:p>
       <w:pPr>
         <w:pStyle w:val="Heading3"/>
@@ -1173,40 +1163,40 @@
           <wp:inline>
             <wp:extent cx="5334000" cy="5010499"/>
             <wp:effectExtent b="0" l="0" r="0" t="0"/>
-            <wp:docPr descr="Instalación de Roles RDS" title="" id="17" name="Picture"/>
-            <ns3:graphic>
-              <ns3:graphicData uri="http://schemas.openxmlformats.org/drawingml/2006/picture">
-                <ns4:pic>
-                  <ns4:nvPicPr>
-                    <ns4:cNvPr descr="images/02_instalacion_rds.png" id="18" name="Picture"/>
-                    <ns4:cNvPicPr>
-                      <ns3:picLocks noChangeArrowheads="1" noChangeAspect="1"/>
-                    </ns4:cNvPicPr>
-                  </ns4:nvPicPr>
-                  <ns4:blipFill>
-                    <ns3:blip r:embed="rId16"/>
-                    <ns3:stretch>
-                      <ns3:fillRect/>
-                    </ns3:stretch>
-                  </ns4:blipFill>
-                  <ns4:spPr bwMode="auto">
-                    <ns3:xfrm>
-                      <ns3:off x="0" y="0"/>
-                      <ns3:ext cx="5334000" cy="5010499"/>
-                    </ns3:xfrm>
-                    <ns3:prstGeom prst="rect">
-                      <ns3:avLst/>
-                    </ns3:prstGeom>
-                    <ns3:noFill/>
-                    <ns3:ln w="9525">
-                      <ns3:noFill/>
-                      <ns3:headEnd/>
-                      <ns3:tailEnd/>
-                    </ns3:ln>
-                  </ns4:spPr>
-                </ns4:pic>
-              </ns3:graphicData>
-            </ns3:graphic>
+            <wp:docPr descr="Instalación de Roles RDS" title="" id="15" name="Picture"/>
+            <ns2:graphic>
+              <ns2:graphicData uri="http://schemas.openxmlformats.org/drawingml/2006/picture">
+                <ns3:pic>
+                  <ns3:nvPicPr>
+                    <ns3:cNvPr descr="images/02_instalacion_rds.png" id="16" name="Picture"/>
+                    <ns3:cNvPicPr>
+                      <ns2:picLocks noChangeArrowheads="1" noChangeAspect="1"/>
+                    </ns3:cNvPicPr>
+                  </ns3:nvPicPr>
+                  <ns3:blipFill>
+                    <ns2:blip r:embed="rId14"/>
+                    <ns2:stretch>
+                      <ns2:fillRect/>
+                    </ns2:stretch>
+                  </ns3:blipFill>
+                  <ns3:spPr bwMode="auto">
+                    <ns2:xfrm>
+                      <ns2:off x="0" y="0"/>
+                      <ns2:ext cx="5334000" cy="5010499"/>
+                    </ns2:xfrm>
+                    <ns2:prstGeom prst="rect">
+                      <ns2:avLst/>
+                    </ns2:prstGeom>
+                    <ns2:noFill/>
+                    <ns2:ln w="9525">
+                      <ns2:noFill/>
+                      <ns2:headEnd/>
+                      <ns2:tailEnd/>
+                    </ns2:ln>
+                  </ns3:spPr>
+                </ns3:pic>
+              </ns2:graphicData>
+            </ns2:graphic>
           </wp:inline>
         </w:drawing>
       </w:r>
@@ -1231,8 +1221,8 @@
         <w:t xml:space="preserve">Figura 2: Confirmación del despliegue del rol de Servicios de Escritorio Remoto</w:t>
       </w:r>
     </w:p>
-    <w:bookmarkEnd w:id="19"/>
-    <w:bookmarkStart w:id="23" w:name="Xf3f053b5e8d3fbb83ad690ac4cf4f40cf09e4d1"/>
+    <w:bookmarkEnd w:id="17"/>
+    <w:bookmarkStart w:id="21" w:name="Xf3f053b5e8d3fbb83ad690ac4cf4f40cf09e4d1"/>
     <w:p>
       <w:pPr>
         <w:pStyle w:val="Heading3"/>
@@ -1395,40 +1385,40 @@
           <wp:inline>
             <wp:extent cx="5334000" cy="2818060"/>
             <wp:effectExtent b="0" l="0" r="0" t="0"/>
-            <wp:docPr descr="Portal de Acceso Web Client HTML5" title="" id="21" name="Picture"/>
-            <ns3:graphic>
-              <ns3:graphicData uri="http://schemas.openxmlformats.org/drawingml/2006/picture">
-                <ns4:pic>
-                  <ns4:nvPicPr>
-                    <ns4:cNvPr descr="images/03_webclient_login.png" id="22" name="Picture"/>
-                    <ns4:cNvPicPr>
-                      <ns3:picLocks noChangeArrowheads="1" noChangeAspect="1"/>
-                    </ns4:cNvPicPr>
-                  </ns4:nvPicPr>
-                  <ns4:blipFill>
-                    <ns3:blip r:embed="rId20"/>
-                    <ns3:stretch>
-                      <ns3:fillRect/>
-                    </ns3:stretch>
-                  </ns4:blipFill>
-                  <ns4:spPr bwMode="auto">
-                    <ns3:xfrm>
-                      <ns3:off x="0" y="0"/>
-                      <ns3:ext cx="5334000" cy="2818060"/>
-                    </ns3:xfrm>
-                    <ns3:prstGeom prst="rect">
-                      <ns3:avLst/>
-                    </ns3:prstGeom>
-                    <ns3:noFill/>
-                    <ns3:ln w="9525">
-                      <ns3:noFill/>
-                      <ns3:headEnd/>
-                      <ns3:tailEnd/>
-                    </ns3:ln>
-                  </ns4:spPr>
-                </ns4:pic>
-              </ns3:graphicData>
-            </ns3:graphic>
+            <wp:docPr descr="Portal de Acceso Web Client HTML5" title="" id="19" name="Picture"/>
+            <ns2:graphic>
+              <ns2:graphicData uri="http://schemas.openxmlformats.org/drawingml/2006/picture">
+                <ns3:pic>
+                  <ns3:nvPicPr>
+                    <ns3:cNvPr descr="images/03_webclient_login.png" id="20" name="Picture"/>
+                    <ns3:cNvPicPr>
+                      <ns2:picLocks noChangeArrowheads="1" noChangeAspect="1"/>
+                    </ns3:cNvPicPr>
+                  </ns3:nvPicPr>
+                  <ns3:blipFill>
+                    <ns2:blip r:embed="rId18"/>
+                    <ns2:stretch>
+                      <ns2:fillRect/>
+                    </ns2:stretch>
+                  </ns3:blipFill>
+                  <ns3:spPr bwMode="auto">
+                    <ns2:xfrm>
+                      <ns2:off x="0" y="0"/>
+                      <ns2:ext cx="5334000" cy="2818060"/>
+                    </ns2:xfrm>
+                    <ns2:prstGeom prst="rect">
+                      <ns2:avLst/>
+                    </ns2:prstGeom>
+                    <ns2:noFill/>
+                    <ns2:ln w="9525">
+                      <ns2:noFill/>
+                      <ns2:headEnd/>
+                      <ns2:tailEnd/>
+                    </ns2:ln>
+                  </ns3:spPr>
+                </ns3:pic>
+              </ns2:graphicData>
+            </ns2:graphic>
           </wp:inline>
         </w:drawing>
       </w:r>
@@ -1470,8 +1460,8 @@
         <w:t xml:space="preserve">https://14.3.50.2/RDWeb/webclient/index.html</w:t>
       </w:r>
     </w:p>
-    <w:bookmarkEnd w:id="23"/>
-    <w:bookmarkStart w:id="27" w:name="Xd38a66d8dbee44401005baae51fa1a7a23f7a4f"/>
+    <w:bookmarkEnd w:id="21"/>
+    <w:bookmarkStart w:id="25" w:name="Xd38a66d8dbee44401005baae51fa1a7a23f7a4f"/>
     <w:p>
       <w:pPr>
         <w:pStyle w:val="Heading3"/>
@@ -1714,40 +1704,40 @@
           <wp:inline>
             <wp:extent cx="5334000" cy="2416968"/>
             <wp:effectExtent b="0" l="0" r="0" t="0"/>
-            <wp:docPr descr="Configuración de IIS" title="" id="25" name="Picture"/>
-            <ns3:graphic>
-              <ns3:graphicData uri="http://schemas.openxmlformats.org/drawingml/2006/picture">
-                <ns4:pic>
-                  <ns4:nvPicPr>
-                    <ns4:cNvPr descr="images/04_iis_config.png" id="26" name="Picture"/>
-                    <ns4:cNvPicPr>
-                      <ns3:picLocks noChangeArrowheads="1" noChangeAspect="1"/>
-                    </ns4:cNvPicPr>
-                  </ns4:nvPicPr>
-                  <ns4:blipFill>
-                    <ns3:blip r:embed="rId24"/>
-                    <ns3:stretch>
-                      <ns3:fillRect/>
-                    </ns3:stretch>
-                  </ns4:blipFill>
-                  <ns4:spPr bwMode="auto">
-                    <ns3:xfrm>
-                      <ns3:off x="0" y="0"/>
-                      <ns3:ext cx="5334000" cy="2416968"/>
-                    </ns3:xfrm>
-                    <ns3:prstGeom prst="rect">
-                      <ns3:avLst/>
-                    </ns3:prstGeom>
-                    <ns3:noFill/>
-                    <ns3:ln w="9525">
-                      <ns3:noFill/>
-                      <ns3:headEnd/>
-                      <ns3:tailEnd/>
-                    </ns3:ln>
-                  </ns4:spPr>
-                </ns4:pic>
-              </ns3:graphicData>
-            </ns3:graphic>
+            <wp:docPr descr="Configuración de IIS" title="" id="23" name="Picture"/>
+            <ns2:graphic>
+              <ns2:graphicData uri="http://schemas.openxmlformats.org/drawingml/2006/picture">
+                <ns3:pic>
+                  <ns3:nvPicPr>
+                    <ns3:cNvPr descr="images/04_iis_config.png" id="24" name="Picture"/>
+                    <ns3:cNvPicPr>
+                      <ns2:picLocks noChangeArrowheads="1" noChangeAspect="1"/>
+                    </ns3:cNvPicPr>
+                  </ns3:nvPicPr>
+                  <ns3:blipFill>
+                    <ns2:blip r:embed="rId22"/>
+                    <ns2:stretch>
+                      <ns2:fillRect/>
+                    </ns2:stretch>
+                  </ns3:blipFill>
+                  <ns3:spPr bwMode="auto">
+                    <ns2:xfrm>
+                      <ns2:off x="0" y="0"/>
+                      <ns2:ext cx="5334000" cy="2416968"/>
+                    </ns2:xfrm>
+                    <ns2:prstGeom prst="rect">
+                      <ns2:avLst/>
+                    </ns2:prstGeom>
+                    <ns2:noFill/>
+                    <ns2:ln w="9525">
+                      <ns2:noFill/>
+                      <ns2:headEnd/>
+                      <ns2:tailEnd/>
+                    </ns2:ln>
+                  </ns3:spPr>
+                </ns3:pic>
+              </ns2:graphicData>
+            </ns2:graphic>
           </wp:inline>
         </w:drawing>
       </w:r>
@@ -1772,8 +1762,8 @@
         <w:t xml:space="preserve">Figura 4: Alta y asignación de bindings para el sitio corporativo personalizado en IIS</w:t>
       </w:r>
     </w:p>
-    <w:bookmarkEnd w:id="27"/>
-    <w:bookmarkStart w:id="31" w:name="X8ad295acd3c1b6bb268e8ee96ac48149ce01b27"/>
+    <w:bookmarkEnd w:id="25"/>
+    <w:bookmarkStart w:id="29" w:name="X8ad295acd3c1b6bb268e8ee96ac48149ce01b27"/>
     <w:p>
       <w:pPr>
         <w:pStyle w:val="Heading3"/>
@@ -2077,40 +2067,40 @@
           <wp:inline>
             <wp:extent cx="5334000" cy="5010499"/>
             <wp:effectExtent b="0" l="0" r="0" t="0"/>
-            <wp:docPr descr="Publicación del sitio en RemoteApp" title="" id="29" name="Picture"/>
-            <ns3:graphic>
-              <ns3:graphicData uri="http://schemas.openxmlformats.org/drawingml/2006/picture">
-                <ns4:pic>
-                  <ns4:nvPicPr>
-                    <ns4:cNvPr descr="images/05_publicacion_remoteapp.png" id="30" name="Picture"/>
-                    <ns4:cNvPicPr>
-                      <ns3:picLocks noChangeArrowheads="1" noChangeAspect="1"/>
-                    </ns4:cNvPicPr>
-                  </ns4:nvPicPr>
-                  <ns4:blipFill>
-                    <ns3:blip r:embed="rId28"/>
-                    <ns3:stretch>
-                      <ns3:fillRect/>
-                    </ns3:stretch>
-                  </ns4:blipFill>
-                  <ns4:spPr bwMode="auto">
-                    <ns3:xfrm>
-                      <ns3:off x="0" y="0"/>
-                      <ns3:ext cx="5334000" cy="5010499"/>
-                    </ns3:xfrm>
-                    <ns3:prstGeom prst="rect">
-                      <ns3:avLst/>
-                    </ns3:prstGeom>
-                    <ns3:noFill/>
-                    <ns3:ln w="9525">
-                      <ns3:noFill/>
-                      <ns3:headEnd/>
-                      <ns3:tailEnd/>
-                    </ns3:ln>
-                  </ns4:spPr>
-                </ns4:pic>
-              </ns3:graphicData>
-            </ns3:graphic>
+            <wp:docPr descr="Publicación del sitio en RemoteApp" title="" id="27" name="Picture"/>
+            <ns2:graphic>
+              <ns2:graphicData uri="http://schemas.openxmlformats.org/drawingml/2006/picture">
+                <ns3:pic>
+                  <ns3:nvPicPr>
+                    <ns3:cNvPr descr="images/05_publicacion_remoteapp.png" id="28" name="Picture"/>
+                    <ns3:cNvPicPr>
+                      <ns2:picLocks noChangeArrowheads="1" noChangeAspect="1"/>
+                    </ns3:cNvPicPr>
+                  </ns3:nvPicPr>
+                  <ns3:blipFill>
+                    <ns2:blip r:embed="rId26"/>
+                    <ns2:stretch>
+                      <ns2:fillRect/>
+                    </ns2:stretch>
+                  </ns3:blipFill>
+                  <ns3:spPr bwMode="auto">
+                    <ns2:xfrm>
+                      <ns2:off x="0" y="0"/>
+                      <ns2:ext cx="5334000" cy="5010499"/>
+                    </ns2:xfrm>
+                    <ns2:prstGeom prst="rect">
+                      <ns2:avLst/>
+                    </ns2:prstGeom>
+                    <ns2:noFill/>
+                    <ns2:ln w="9525">
+                      <ns2:noFill/>
+                      <ns2:headEnd/>
+                      <ns2:tailEnd/>
+                    </ns2:ln>
+                  </ns3:spPr>
+                </ns3:pic>
+              </ns2:graphicData>
+            </ns2:graphic>
           </wp:inline>
         </w:drawing>
       </w:r>
@@ -2135,9 +2125,9 @@
         <w:t xml:space="preserve">Figura 5: Propiedades del RemoteApp configuradas para ejecutar Edge con parámetros de URL específicos</w:t>
       </w:r>
     </w:p>
-    <w:bookmarkEnd w:id="31"/>
-    <w:bookmarkEnd w:id="32"/>
-    <w:bookmarkStart w:id="49" w:name="X04ecf62bdfa7a8f3b9372e1f079983aa1f3ac4d"/>
+    <w:bookmarkEnd w:id="29"/>
+    <w:bookmarkEnd w:id="30"/>
+    <w:bookmarkStart w:id="47" w:name="X04ecf62bdfa7a8f3b9372e1f079983aa1f3ac4d"/>
     <w:p>
       <w:pPr>
         <w:pStyle w:val="Heading2"/>
@@ -2156,7 +2146,7 @@
         <w:t xml:space="preserve">El Network Policy Server (NPS) centraliza la autenticación y autorización en la infraestructura. Se configurará para atender solicitudes del Router Cisco y mapear el nivel de privilegio de los administradores según su pertenencia a grupos en Active Directory.</w:t>
       </w:r>
     </w:p>
-    <w:bookmarkStart w:id="36" w:name="Xef677c0672188a9ccd290b03e56202ad32419ca"/>
+    <w:bookmarkStart w:id="34" w:name="Xef677c0672188a9ccd290b03e56202ad32419ca"/>
     <w:p>
       <w:pPr>
         <w:pStyle w:val="Heading3"/>
@@ -2349,40 +2339,40 @@
           <wp:inline>
             <wp:extent cx="5334000" cy="2716977"/>
             <wp:effectExtent b="0" l="0" r="0" t="0"/>
-            <wp:docPr descr="Grupo RADIUS-Admin-L15 en AD" title="" id="34" name="Picture"/>
-            <ns3:graphic>
-              <ns3:graphicData uri="http://schemas.openxmlformats.org/drawingml/2006/picture">
-                <ns4:pic>
-                  <ns4:nvPicPr>
-                    <ns4:cNvPr descr="images/06_active_directory_group_admin.png" id="35" name="Picture"/>
-                    <ns4:cNvPicPr>
-                      <ns3:picLocks noChangeArrowheads="1" noChangeAspect="1"/>
-                    </ns4:cNvPicPr>
-                  </ns4:nvPicPr>
-                  <ns4:blipFill>
-                    <ns3:blip r:embed="rId33"/>
-                    <ns3:stretch>
-                      <ns3:fillRect/>
-                    </ns3:stretch>
-                  </ns4:blipFill>
-                  <ns4:spPr bwMode="auto">
-                    <ns3:xfrm>
-                      <ns3:off x="0" y="0"/>
-                      <ns3:ext cx="5334000" cy="2716977"/>
-                    </ns3:xfrm>
-                    <ns3:prstGeom prst="rect">
-                      <ns3:avLst/>
-                    </ns3:prstGeom>
-                    <ns3:noFill/>
-                    <ns3:ln w="9525">
-                      <ns3:noFill/>
-                      <ns3:headEnd/>
-                      <ns3:tailEnd/>
-                    </ns3:ln>
-                  </ns4:spPr>
-                </ns4:pic>
-              </ns3:graphicData>
-            </ns3:graphic>
+            <wp:docPr descr="Grupo RADIUS-Admin-L15 en AD" title="" id="32" name="Picture"/>
+            <ns2:graphic>
+              <ns2:graphicData uri="http://schemas.openxmlformats.org/drawingml/2006/picture">
+                <ns3:pic>
+                  <ns3:nvPicPr>
+                    <ns3:cNvPr descr="images/06_active_directory_group_admin.png" id="33" name="Picture"/>
+                    <ns3:cNvPicPr>
+                      <ns2:picLocks noChangeArrowheads="1" noChangeAspect="1"/>
+                    </ns3:cNvPicPr>
+                  </ns3:nvPicPr>
+                  <ns3:blipFill>
+                    <ns2:blip r:embed="rId31"/>
+                    <ns2:stretch>
+                      <ns2:fillRect/>
+                    </ns2:stretch>
+                  </ns3:blipFill>
+                  <ns3:spPr bwMode="auto">
+                    <ns2:xfrm>
+                      <ns2:off x="0" y="0"/>
+                      <ns2:ext cx="5334000" cy="2716977"/>
+                    </ns2:xfrm>
+                    <ns2:prstGeom prst="rect">
+                      <ns2:avLst/>
+                    </ns2:prstGeom>
+                    <ns2:noFill/>
+                    <ns2:ln w="9525">
+                      <ns2:noFill/>
+                      <ns2:headEnd/>
+                      <ns2:tailEnd/>
+                    </ns2:ln>
+                  </ns3:spPr>
+                </ns3:pic>
+              </ns2:graphicData>
+            </ns2:graphic>
           </wp:inline>
         </w:drawing>
       </w:r>
@@ -2407,8 +2397,8 @@
         <w:t xml:space="preserve">Figura 6: Grupos de Active Directory y asignación de usuarios (L15 para ARD y L1 para USR)</w:t>
       </w:r>
     </w:p>
-    <w:bookmarkEnd w:id="36"/>
-    <w:bookmarkStart w:id="40" w:name="X5d3598463a77b3825c5f16c5bb9125bd0c5d0f5"/>
+    <w:bookmarkEnd w:id="34"/>
+    <w:bookmarkStart w:id="38" w:name="X5d3598463a77b3825c5f16c5bb9125bd0c5d0f5"/>
     <w:p>
       <w:pPr>
         <w:pStyle w:val="Heading3"/>
@@ -2636,40 +2626,40 @@
           <wp:inline>
             <wp:extent cx="5334000" cy="1722303"/>
             <wp:effectExtent b="0" l="0" r="0" t="0"/>
-            <wp:docPr descr="Cliente RADIUS en NPS" title="" id="38" name="Picture"/>
-            <ns3:graphic>
-              <ns3:graphicData uri="http://schemas.openxmlformats.org/drawingml/2006/picture">
-                <ns4:pic>
-                  <ns4:nvPicPr>
-                    <ns4:cNvPr descr="images/07_nps_radius_client.png" id="39" name="Picture"/>
-                    <ns4:cNvPicPr>
-                      <ns3:picLocks noChangeArrowheads="1" noChangeAspect="1"/>
-                    </ns4:cNvPicPr>
-                  </ns4:nvPicPr>
-                  <ns4:blipFill>
-                    <ns3:blip r:embed="rId37"/>
-                    <ns3:stretch>
-                      <ns3:fillRect/>
-                    </ns3:stretch>
-                  </ns4:blipFill>
-                  <ns4:spPr bwMode="auto">
-                    <ns3:xfrm>
-                      <ns3:off x="0" y="0"/>
-                      <ns3:ext cx="5334000" cy="1722303"/>
-                    </ns3:xfrm>
-                    <ns3:prstGeom prst="rect">
-                      <ns3:avLst/>
-                    </ns3:prstGeom>
-                    <ns3:noFill/>
-                    <ns3:ln w="9525">
-                      <ns3:noFill/>
-                      <ns3:headEnd/>
-                      <ns3:tailEnd/>
-                    </ns3:ln>
-                  </ns4:spPr>
-                </ns4:pic>
-              </ns3:graphicData>
-            </ns3:graphic>
+            <wp:docPr descr="Cliente RADIUS en NPS" title="" id="36" name="Picture"/>
+            <ns2:graphic>
+              <ns2:graphicData uri="http://schemas.openxmlformats.org/drawingml/2006/picture">
+                <ns3:pic>
+                  <ns3:nvPicPr>
+                    <ns3:cNvPr descr="images/07_nps_radius_client.png" id="37" name="Picture"/>
+                    <ns3:cNvPicPr>
+                      <ns2:picLocks noChangeArrowheads="1" noChangeAspect="1"/>
+                    </ns3:cNvPicPr>
+                  </ns3:nvPicPr>
+                  <ns3:blipFill>
+                    <ns2:blip r:embed="rId35"/>
+                    <ns2:stretch>
+                      <ns2:fillRect/>
+                    </ns2:stretch>
+                  </ns3:blipFill>
+                  <ns3:spPr bwMode="auto">
+                    <ns2:xfrm>
+                      <ns2:off x="0" y="0"/>
+                      <ns2:ext cx="5334000" cy="1722303"/>
+                    </ns2:xfrm>
+                    <ns2:prstGeom prst="rect">
+                      <ns2:avLst/>
+                    </ns2:prstGeom>
+                    <ns2:noFill/>
+                    <ns2:ln w="9525">
+                      <ns2:noFill/>
+                      <ns2:headEnd/>
+                      <ns2:tailEnd/>
+                    </ns2:ln>
+                  </ns3:spPr>
+                </ns3:pic>
+              </ns2:graphicData>
+            </ns2:graphic>
           </wp:inline>
         </w:drawing>
       </w:r>
@@ -2694,8 +2684,8 @@
         <w:t xml:space="preserve">Figura 7: Registro y clave compartida para el Router Cisco en el servidor NPS</w:t>
       </w:r>
     </w:p>
-    <w:bookmarkEnd w:id="40"/>
-    <w:bookmarkStart w:id="48" w:name="X6d52511fcbccfcd2639459f8388e70c641f67b0"/>
+    <w:bookmarkEnd w:id="38"/>
+    <w:bookmarkStart w:id="46" w:name="X6d52511fcbccfcd2639459f8388e70c641f67b0"/>
     <w:p>
       <w:pPr>
         <w:pStyle w:val="Heading3"/>
@@ -2714,7 +2704,7 @@
         <w:t xml:space="preserve">Para enviar el nivel de privilegio correcto al router Cisco tras un inicio de sesión por SSH exitoso, debemos configurar políticas de red en NPS que inyecten un atributo específico del fabricante (Vendor-Specific Attribute - VSA).</w:t>
       </w:r>
     </w:p>
-    <w:bookmarkStart w:id="44" w:name="X8aec1659f8062f6ffc2b5ce7ed34456aab695e5"/>
+    <w:bookmarkStart w:id="42" w:name="X8aec1659f8062f6ffc2b5ce7ed34456aab695e5"/>
     <w:p>
       <w:pPr>
         <w:pStyle w:val="Heading4"/>
@@ -3185,40 +3175,40 @@
           <wp:inline>
             <wp:extent cx="5334000" cy="1711990"/>
             <wp:effectExtent b="0" l="0" r="0" t="0"/>
-            <wp:docPr descr="Políticas de Red en NPS" title="" id="42" name="Picture"/>
-            <ns3:graphic>
-              <ns3:graphicData uri="http://schemas.openxmlformats.org/drawingml/2006/picture">
-                <ns4:pic>
-                  <ns4:nvPicPr>
-                    <ns4:cNvPr descr="images/08_nps_policies_list.png" id="43" name="Picture"/>
-                    <ns4:cNvPicPr>
-                      <ns3:picLocks noChangeArrowheads="1" noChangeAspect="1"/>
-                    </ns4:cNvPicPr>
-                  </ns4:nvPicPr>
-                  <ns4:blipFill>
-                    <ns3:blip r:embed="rId41"/>
-                    <ns3:stretch>
-                      <ns3:fillRect/>
-                    </ns3:stretch>
-                  </ns4:blipFill>
-                  <ns4:spPr bwMode="auto">
-                    <ns3:xfrm>
-                      <ns3:off x="0" y="0"/>
-                      <ns3:ext cx="5334000" cy="1711990"/>
-                    </ns3:xfrm>
-                    <ns3:prstGeom prst="rect">
-                      <ns3:avLst/>
-                    </ns3:prstGeom>
-                    <ns3:noFill/>
-                    <ns3:ln w="9525">
-                      <ns3:noFill/>
-                      <ns3:headEnd/>
-                      <ns3:tailEnd/>
-                    </ns3:ln>
-                  </ns4:spPr>
-                </ns4:pic>
-              </ns3:graphicData>
-            </ns3:graphic>
+            <wp:docPr descr="Políticas de Red en NPS" title="" id="40" name="Picture"/>
+            <ns2:graphic>
+              <ns2:graphicData uri="http://schemas.openxmlformats.org/drawingml/2006/picture">
+                <ns3:pic>
+                  <ns3:nvPicPr>
+                    <ns3:cNvPr descr="images/08_nps_policies_list.png" id="41" name="Picture"/>
+                    <ns3:cNvPicPr>
+                      <ns2:picLocks noChangeArrowheads="1" noChangeAspect="1"/>
+                    </ns3:cNvPicPr>
+                  </ns3:nvPicPr>
+                  <ns3:blipFill>
+                    <ns2:blip r:embed="rId39"/>
+                    <ns2:stretch>
+                      <ns2:fillRect/>
+                    </ns2:stretch>
+                  </ns3:blipFill>
+                  <ns3:spPr bwMode="auto">
+                    <ns2:xfrm>
+                      <ns2:off x="0" y="0"/>
+                      <ns2:ext cx="5334000" cy="1711990"/>
+                    </ns2:xfrm>
+                    <ns2:prstGeom prst="rect">
+                      <ns2:avLst/>
+                    </ns2:prstGeom>
+                    <ns2:noFill/>
+                    <ns2:ln w="9525">
+                      <ns2:noFill/>
+                      <ns2:headEnd/>
+                      <ns2:tailEnd/>
+                    </ns2:ln>
+                  </ns3:spPr>
+                </ns3:pic>
+              </ns2:graphicData>
+            </ns2:graphic>
           </wp:inline>
         </w:drawing>
       </w:r>
@@ -3243,8 +3233,8 @@
         <w:t xml:space="preserve">Figura 8: Políticas de red configuradas en el servidor NPS para los niveles de privilegio Cisco</w:t>
       </w:r>
     </w:p>
-    <w:bookmarkEnd w:id="44"/>
-    <w:bookmarkStart w:id="47" w:name="X37474dddf7764d9cd03bde0c80082f676e86efe"/>
+    <w:bookmarkEnd w:id="42"/>
+    <w:bookmarkStart w:id="45" w:name="X37474dddf7764d9cd03bde0c80082f676e86efe"/>
     <w:p>
       <w:pPr>
         <w:pStyle w:val="Heading4"/>
@@ -3598,40 +3588,40 @@
           <wp:inline>
             <wp:extent cx="5334000" cy="1711990"/>
             <wp:effectExtent b="0" l="0" r="0" t="0"/>
-            <wp:docPr descr="Lista de Políticas en NPS" title="" id="45" name="Picture"/>
-            <ns3:graphic>
-              <ns3:graphicData uri="http://schemas.openxmlformats.org/drawingml/2006/picture">
-                <ns4:pic>
-                  <ns4:nvPicPr>
-                    <ns4:cNvPr descr="images/08_nps_policies_list.png" id="46" name="Picture"/>
-                    <ns4:cNvPicPr>
-                      <ns3:picLocks noChangeArrowheads="1" noChangeAspect="1"/>
-                    </ns4:cNvPicPr>
-                  </ns4:nvPicPr>
-                  <ns4:blipFill>
-                    <ns3:blip r:embed="rId41"/>
-                    <ns3:stretch>
-                      <ns3:fillRect/>
-                    </ns3:stretch>
-                  </ns4:blipFill>
-                  <ns4:spPr bwMode="auto">
-                    <ns3:xfrm>
-                      <ns3:off x="0" y="0"/>
-                      <ns3:ext cx="5334000" cy="1711990"/>
-                    </ns3:xfrm>
-                    <ns3:prstGeom prst="rect">
-                      <ns3:avLst/>
-                    </ns3:prstGeom>
-                    <ns3:noFill/>
-                    <ns3:ln w="9525">
-                      <ns3:noFill/>
-                      <ns3:headEnd/>
-                      <ns3:tailEnd/>
-                    </ns3:ln>
-                  </ns4:spPr>
-                </ns4:pic>
-              </ns3:graphicData>
-            </ns3:graphic>
+            <wp:docPr descr="Lista de Políticas en NPS" title="" id="43" name="Picture"/>
+            <ns2:graphic>
+              <ns2:graphicData uri="http://schemas.openxmlformats.org/drawingml/2006/picture">
+                <ns3:pic>
+                  <ns3:nvPicPr>
+                    <ns3:cNvPr descr="images/08_nps_policies_list.png" id="44" name="Picture"/>
+                    <ns3:cNvPicPr>
+                      <ns2:picLocks noChangeArrowheads="1" noChangeAspect="1"/>
+                    </ns3:cNvPicPr>
+                  </ns3:nvPicPr>
+                  <ns3:blipFill>
+                    <ns2:blip r:embed="rId39"/>
+                    <ns2:stretch>
+                      <ns2:fillRect/>
+                    </ns2:stretch>
+                  </ns3:blipFill>
+                  <ns3:spPr bwMode="auto">
+                    <ns2:xfrm>
+                      <ns2:off x="0" y="0"/>
+                      <ns2:ext cx="5334000" cy="1711990"/>
+                    </ns2:xfrm>
+                    <ns2:prstGeom prst="rect">
+                      <ns2:avLst/>
+                    </ns2:prstGeom>
+                    <ns2:noFill/>
+                    <ns2:ln w="9525">
+                      <ns2:noFill/>
+                      <ns2:headEnd/>
+                      <ns2:tailEnd/>
+                    </ns2:ln>
+                  </ns3:spPr>
+                </ns3:pic>
+              </ns2:graphicData>
+            </ns2:graphic>
           </wp:inline>
         </w:drawing>
       </w:r>
@@ -3656,10 +3646,10 @@
         <w:t xml:space="preserve">Figura 9: Listado jerárquico de políticas en NPS con prioridad en la evaluación de accesos</w:t>
       </w:r>
     </w:p>
+    <w:bookmarkEnd w:id="45"/>
+    <w:bookmarkEnd w:id="46"/>
     <w:bookmarkEnd w:id="47"/>
-    <w:bookmarkEnd w:id="48"/>
-    <w:bookmarkEnd w:id="49"/>
-    <w:bookmarkStart w:id="55" w:name="X6d7ad66f92390a4edc881cec2a90e42ce54ff3c"/>
+    <w:bookmarkStart w:id="53" w:name="X6d7ad66f92390a4edc881cec2a90e42ce54ff3c"/>
     <w:p>
       <w:pPr>
         <w:pStyle w:val="Heading2"/>
@@ -3686,7 +3676,7 @@
         <w:t xml:space="preserve">A continuación se detallan los pasos y configuraciones aplicados al router:</w:t>
       </w:r>
     </w:p>
-    <w:bookmarkStart w:id="50" w:name="Xa9e1f378af0dabca5d463ac3de36160a76b5ba8"/>
+    <w:bookmarkStart w:id="48" w:name="Xa9e1f378af0dabca5d463ac3de36160a76b5ba8"/>
     <w:p>
       <w:pPr>
         <w:pStyle w:val="Heading3"/>
@@ -3998,8 +3988,8 @@
         <w:t xml:space="preserve">ip nat inside source list 1 interface Ethernet0/2 overload</w:t>
       </w:r>
     </w:p>
-    <w:bookmarkEnd w:id="50"/>
-    <w:bookmarkStart w:id="51" w:name="X42c18d90b50dc41f9b5e190cadbd263f7e718e0"/>
+    <w:bookmarkEnd w:id="48"/>
+    <w:bookmarkStart w:id="49" w:name="X42c18d90b50dc41f9b5e190cadbd263f7e718e0"/>
     <w:p>
       <w:pPr>
         <w:pStyle w:val="Heading3"/>
@@ -4038,8 +4028,8 @@
         <w:t xml:space="preserve">enable secret EnableSecretPass992</w:t>
       </w:r>
     </w:p>
-    <w:bookmarkEnd w:id="51"/>
-    <w:bookmarkStart w:id="52" w:name="X00161dc34e41db584a915afe5d4930139ca3a04"/>
+    <w:bookmarkEnd w:id="49"/>
+    <w:bookmarkStart w:id="50" w:name="X00161dc34e41db584a915afe5d4930139ca3a04"/>
     <w:p>
       <w:pPr>
         <w:pStyle w:val="Heading3"/>
@@ -4117,8 +4107,8 @@
         <w:t xml:space="preserve"> key ClaveSecretaRadius992</w:t>
       </w:r>
     </w:p>
-    <w:bookmarkEnd w:id="52"/>
-    <w:bookmarkStart w:id="53" w:name="X5dc53541dc5f381e65ebe31c89448ef43900457"/>
+    <w:bookmarkEnd w:id="50"/>
+    <w:bookmarkStart w:id="51" w:name="X5dc53541dc5f381e65ebe31c89448ef43900457"/>
     <w:p>
       <w:pPr>
         <w:pStyle w:val="Heading3"/>
@@ -4259,8 +4249,8 @@
         <w:t xml:space="preserve">aaa accounting commands 15 default start-stop group radius</w:t>
       </w:r>
     </w:p>
-    <w:bookmarkEnd w:id="53"/>
-    <w:bookmarkStart w:id="54" w:name="X24c1248492e8ef19e0ed33cb0e52094c8c514bc"/>
+    <w:bookmarkEnd w:id="51"/>
+    <w:bookmarkStart w:id="52" w:name="X24c1248492e8ef19e0ed33cb0e52094c8c514bc"/>
     <w:p>
       <w:pPr>
         <w:pStyle w:val="Heading3"/>
@@ -4359,9 +4349,9 @@
         <w:t xml:space="preserve">exit</w:t>
       </w:r>
     </w:p>
-    <w:bookmarkEnd w:id="54"/>
-    <w:bookmarkEnd w:id="55"/>
-    <w:bookmarkStart w:id="90" w:name="Xa9c7252ba128745b4ad9e9f1fcf139a2d5481ce"/>
+    <w:bookmarkEnd w:id="52"/>
+    <w:bookmarkEnd w:id="53"/>
+    <w:bookmarkStart w:id="88" w:name="Xa9c7252ba128745b4ad9e9f1fcf139a2d5481ce"/>
     <w:p>
       <w:pPr>
         <w:pStyle w:val="Heading2"/>
@@ -4372,7 +4362,7 @@
         <w:t xml:space="preserve">6. Pruebas de Funcionamiento y Evidencias de Conectividad</w:t>
       </w:r>
     </w:p>
-    <w:bookmarkStart w:id="65" w:name="X13b2568072d8bf8dbbbcf0dcd0be5941ac60117"/>
+    <w:bookmarkStart w:id="63" w:name="X13b2568072d8bf8dbbbcf0dcd0be5941ac60117"/>
     <w:p>
       <w:pPr>
         <w:pStyle w:val="Heading3"/>
@@ -4496,40 +4486,40 @@
           <wp:inline>
             <wp:extent cx="5334000" cy="3197186"/>
             <wp:effectExtent b="0" l="0" r="0" t="0"/>
-            <wp:docPr descr="Login en RDWeb Clásico" title="" id="57" name="Picture"/>
-            <ns3:graphic>
-              <ns3:graphicData uri="http://schemas.openxmlformats.org/drawingml/2006/picture">
-                <ns4:pic>
-                  <ns4:nvPicPr>
-                    <ns4:cNvPr descr="images/02_rdweb_login.png" id="58" name="Picture"/>
-                    <ns4:cNvPicPr>
-                      <ns3:picLocks noChangeArrowheads="1" noChangeAspect="1"/>
-                    </ns4:cNvPicPr>
-                  </ns4:nvPicPr>
-                  <ns4:blipFill>
-                    <ns3:blip r:embed="rId56"/>
-                    <ns3:stretch>
-                      <ns3:fillRect/>
-                    </ns3:stretch>
-                  </ns4:blipFill>
-                  <ns4:spPr bwMode="auto">
-                    <ns3:xfrm>
-                      <ns3:off x="0" y="0"/>
-                      <ns3:ext cx="5334000" cy="3197186"/>
-                    </ns3:xfrm>
-                    <ns3:prstGeom prst="rect">
-                      <ns3:avLst/>
-                    </ns3:prstGeom>
-                    <ns3:noFill/>
-                    <ns3:ln w="9525">
-                      <ns3:noFill/>
-                      <ns3:headEnd/>
-                      <ns3:tailEnd/>
-                    </ns3:ln>
-                  </ns4:spPr>
-                </ns4:pic>
-              </ns3:graphicData>
-            </ns3:graphic>
+            <wp:docPr descr="Login en RDWeb Clásico" title="" id="55" name="Picture"/>
+            <ns2:graphic>
+              <ns2:graphicData uri="http://schemas.openxmlformats.org/drawingml/2006/picture">
+                <ns3:pic>
+                  <ns3:nvPicPr>
+                    <ns3:cNvPr descr="images/02_rdweb_login.png" id="56" name="Picture"/>
+                    <ns3:cNvPicPr>
+                      <ns2:picLocks noChangeArrowheads="1" noChangeAspect="1"/>
+                    </ns3:cNvPicPr>
+                  </ns3:nvPicPr>
+                  <ns3:blipFill>
+                    <ns2:blip r:embed="rId54"/>
+                    <ns2:stretch>
+                      <ns2:fillRect/>
+                    </ns2:stretch>
+                  </ns3:blipFill>
+                  <ns3:spPr bwMode="auto">
+                    <ns2:xfrm>
+                      <ns2:off x="0" y="0"/>
+                      <ns2:ext cx="5334000" cy="3197186"/>
+                    </ns2:xfrm>
+                    <ns2:prstGeom prst="rect">
+                      <ns2:avLst/>
+                    </ns2:prstGeom>
+                    <ns2:noFill/>
+                    <ns2:ln w="9525">
+                      <ns2:noFill/>
+                      <ns2:headEnd/>
+                      <ns2:tailEnd/>
+                    </ns2:ln>
+                  </ns3:spPr>
+                </ns3:pic>
+              </ns2:graphicData>
+            </ns2:graphic>
           </wp:inline>
         </w:drawing>
       </w:r>
@@ -4565,40 +4555,40 @@
           <wp:inline>
             <wp:extent cx="5334000" cy="2153773"/>
             <wp:effectExtent b="0" l="0" r="0" t="0"/>
-            <wp:docPr descr="Alerta Editor Desconocido" title="" id="60" name="Picture"/>
-            <ns3:graphic>
-              <ns3:graphicData uri="http://schemas.openxmlformats.org/drawingml/2006/picture">
-                <ns4:pic>
-                  <ns4:nvPicPr>
-                    <ns4:cNvPr descr="images/10_remoteapp_publisher_warning.png" id="61" name="Picture"/>
-                    <ns4:cNvPicPr>
-                      <ns3:picLocks noChangeArrowheads="1" noChangeAspect="1"/>
-                    </ns4:cNvPicPr>
-                  </ns4:nvPicPr>
-                  <ns4:blipFill>
-                    <ns3:blip r:embed="rId59"/>
-                    <ns3:stretch>
-                      <ns3:fillRect/>
-                    </ns3:stretch>
-                  </ns4:blipFill>
-                  <ns4:spPr bwMode="auto">
-                    <ns3:xfrm>
-                      <ns3:off x="0" y="0"/>
-                      <ns3:ext cx="5334000" cy="2153773"/>
-                    </ns3:xfrm>
-                    <ns3:prstGeom prst="rect">
-                      <ns3:avLst/>
-                    </ns3:prstGeom>
-                    <ns3:noFill/>
-                    <ns3:ln w="9525">
-                      <ns3:noFill/>
-                      <ns3:headEnd/>
-                      <ns3:tailEnd/>
-                    </ns3:ln>
-                  </ns4:spPr>
-                </ns4:pic>
-              </ns3:graphicData>
-            </ns3:graphic>
+            <wp:docPr descr="Alerta Editor Desconocido" title="" id="58" name="Picture"/>
+            <ns2:graphic>
+              <ns2:graphicData uri="http://schemas.openxmlformats.org/drawingml/2006/picture">
+                <ns3:pic>
+                  <ns3:nvPicPr>
+                    <ns3:cNvPr descr="images/10_remoteapp_publisher_warning.png" id="59" name="Picture"/>
+                    <ns3:cNvPicPr>
+                      <ns2:picLocks noChangeArrowheads="1" noChangeAspect="1"/>
+                    </ns3:cNvPicPr>
+                  </ns3:nvPicPr>
+                  <ns3:blipFill>
+                    <ns2:blip r:embed="rId57"/>
+                    <ns2:stretch>
+                      <ns2:fillRect/>
+                    </ns2:stretch>
+                  </ns3:blipFill>
+                  <ns3:spPr bwMode="auto">
+                    <ns2:xfrm>
+                      <ns2:off x="0" y="0"/>
+                      <ns2:ext cx="5334000" cy="2153773"/>
+                    </ns2:xfrm>
+                    <ns2:prstGeom prst="rect">
+                      <ns2:avLst/>
+                    </ns2:prstGeom>
+                    <ns2:noFill/>
+                    <ns2:ln w="9525">
+                      <ns2:noFill/>
+                      <ns2:headEnd/>
+                      <ns2:tailEnd/>
+                    </ns2:ln>
+                  </ns3:spPr>
+                </ns3:pic>
+              </ns2:graphicData>
+            </ns2:graphic>
           </wp:inline>
         </w:drawing>
       </w:r>
@@ -4634,40 +4624,40 @@
           <wp:inline>
             <wp:extent cx="5334000" cy="4174924"/>
             <wp:effectExtent b="0" l="0" r="0" t="0"/>
-            <wp:docPr descr="Acceso Exitoso Portal Clásico" title="" id="63" name="Picture"/>
-            <ns3:graphic>
-              <ns3:graphicData uri="http://schemas.openxmlformats.org/drawingml/2006/picture">
-                <ns4:pic>
-                  <ns4:nvPicPr>
-                    <ns4:cNvPr descr="images/10_remoteapp_classic_test.png" id="64" name="Picture"/>
-                    <ns4:cNvPicPr>
-                      <ns3:picLocks noChangeArrowheads="1" noChangeAspect="1"/>
-                    </ns4:cNvPicPr>
-                  </ns4:nvPicPr>
-                  <ns4:blipFill>
-                    <ns3:blip r:embed="rId62"/>
-                    <ns3:stretch>
-                      <ns3:fillRect/>
-                    </ns3:stretch>
-                  </ns4:blipFill>
-                  <ns4:spPr bwMode="auto">
-                    <ns3:xfrm>
-                      <ns3:off x="0" y="0"/>
-                      <ns3:ext cx="5334000" cy="4174924"/>
-                    </ns3:xfrm>
-                    <ns3:prstGeom prst="rect">
-                      <ns3:avLst/>
-                    </ns3:prstGeom>
-                    <ns3:noFill/>
-                    <ns3:ln w="9525">
-                      <ns3:noFill/>
-                      <ns3:headEnd/>
-                      <ns3:tailEnd/>
-                    </ns3:ln>
-                  </ns4:spPr>
-                </ns4:pic>
-              </ns3:graphicData>
-            </ns3:graphic>
+            <wp:docPr descr="Acceso Exitoso Portal Clásico" title="" id="61" name="Picture"/>
+            <ns2:graphic>
+              <ns2:graphicData uri="http://schemas.openxmlformats.org/drawingml/2006/picture">
+                <ns3:pic>
+                  <ns3:nvPicPr>
+                    <ns3:cNvPr descr="images/10_remoteapp_classic_test.png" id="62" name="Picture"/>
+                    <ns3:cNvPicPr>
+                      <ns2:picLocks noChangeArrowheads="1" noChangeAspect="1"/>
+                    </ns3:cNvPicPr>
+                  </ns3:nvPicPr>
+                  <ns3:blipFill>
+                    <ns2:blip r:embed="rId60"/>
+                    <ns2:stretch>
+                      <ns2:fillRect/>
+                    </ns2:stretch>
+                  </ns3:blipFill>
+                  <ns3:spPr bwMode="auto">
+                    <ns2:xfrm>
+                      <ns2:off x="0" y="0"/>
+                      <ns2:ext cx="5334000" cy="4174924"/>
+                    </ns2:xfrm>
+                    <ns2:prstGeom prst="rect">
+                      <ns2:avLst/>
+                    </ns2:prstGeom>
+                    <ns2:noFill/>
+                    <ns2:ln w="9525">
+                      <ns2:noFill/>
+                      <ns2:headEnd/>
+                      <ns2:tailEnd/>
+                    </ns2:ln>
+                  </ns3:spPr>
+                </ns3:pic>
+              </ns2:graphicData>
+            </ns2:graphic>
           </wp:inline>
         </w:drawing>
       </w:r>
@@ -4692,8 +4682,8 @@
         <w:t xml:space="preserve">Figura 10.2: Intranet corporativa ejecutándose de forma remota en una ventana aislada a través del cliente clásico RemoteApp</w:t>
       </w:r>
     </w:p>
-    <w:bookmarkEnd w:id="65"/>
-    <w:bookmarkStart w:id="71" w:name="X64f48dd7cd719f2980b60e1d9a4ac4c059d5220"/>
+    <w:bookmarkEnd w:id="63"/>
+    <w:bookmarkStart w:id="69" w:name="X64f48dd7cd719f2980b60e1d9a4ac4c059d5220"/>
     <w:p>
       <w:pPr>
         <w:pStyle w:val="Heading3"/>
@@ -4793,40 +4783,40 @@
           <wp:inline>
             <wp:extent cx="5334000" cy="2818060"/>
             <wp:effectExtent b="0" l="0" r="0" t="0"/>
-            <wp:docPr descr="Login en Web Client" title="" id="66" name="Picture"/>
-            <ns3:graphic>
-              <ns3:graphicData uri="http://schemas.openxmlformats.org/drawingml/2006/picture">
-                <ns4:pic>
-                  <ns4:nvPicPr>
-                    <ns4:cNvPr descr="images/03_webclient_login.png" id="67" name="Picture"/>
-                    <ns4:cNvPicPr>
-                      <ns3:picLocks noChangeArrowheads="1" noChangeAspect="1"/>
-                    </ns4:cNvPicPr>
-                  </ns4:nvPicPr>
-                  <ns4:blipFill>
-                    <ns3:blip r:embed="rId20"/>
-                    <ns3:stretch>
-                      <ns3:fillRect/>
-                    </ns3:stretch>
-                  </ns4:blipFill>
-                  <ns4:spPr bwMode="auto">
-                    <ns3:xfrm>
-                      <ns3:off x="0" y="0"/>
-                      <ns3:ext cx="5334000" cy="2818060"/>
-                    </ns3:xfrm>
-                    <ns3:prstGeom prst="rect">
-                      <ns3:avLst/>
-                    </ns3:prstGeom>
-                    <ns3:noFill/>
-                    <ns3:ln w="9525">
-                      <ns3:noFill/>
-                      <ns3:headEnd/>
-                      <ns3:tailEnd/>
-                    </ns3:ln>
-                  </ns4:spPr>
-                </ns4:pic>
-              </ns3:graphicData>
-            </ns3:graphic>
+            <wp:docPr descr="Login en Web Client" title="" id="64" name="Picture"/>
+            <ns2:graphic>
+              <ns2:graphicData uri="http://schemas.openxmlformats.org/drawingml/2006/picture">
+                <ns3:pic>
+                  <ns3:nvPicPr>
+                    <ns3:cNvPr descr="images/03_webclient_login.png" id="65" name="Picture"/>
+                    <ns3:cNvPicPr>
+                      <ns2:picLocks noChangeArrowheads="1" noChangeAspect="1"/>
+                    </ns3:cNvPicPr>
+                  </ns3:nvPicPr>
+                  <ns3:blipFill>
+                    <ns2:blip r:embed="rId18"/>
+                    <ns2:stretch>
+                      <ns2:fillRect/>
+                    </ns2:stretch>
+                  </ns3:blipFill>
+                  <ns3:spPr bwMode="auto">
+                    <ns2:xfrm>
+                      <ns2:off x="0" y="0"/>
+                      <ns2:ext cx="5334000" cy="2818060"/>
+                    </ns2:xfrm>
+                    <ns2:prstGeom prst="rect">
+                      <ns2:avLst/>
+                    </ns2:prstGeom>
+                    <ns2:noFill/>
+                    <ns2:ln w="9525">
+                      <ns2:noFill/>
+                      <ns2:headEnd/>
+                      <ns2:tailEnd/>
+                    </ns2:ln>
+                  </ns3:spPr>
+                </ns3:pic>
+              </ns2:graphicData>
+            </ns2:graphic>
           </wp:inline>
         </w:drawing>
       </w:r>
@@ -4862,40 +4852,40 @@
           <wp:inline>
             <wp:extent cx="5334000" cy="3983007"/>
             <wp:effectExtent b="0" l="0" r="0" t="0"/>
-            <wp:docPr descr="Acceso Exitoso Web Client" title="" id="69" name="Picture"/>
-            <ns3:graphic>
-              <ns3:graphicData uri="http://schemas.openxmlformats.org/drawingml/2006/picture">
-                <ns4:pic>
-                  <ns4:nvPicPr>
-                    <ns4:cNvPr descr="images/11_remoteapp_webclient_test.png" id="70" name="Picture"/>
-                    <ns4:cNvPicPr>
-                      <ns3:picLocks noChangeArrowheads="1" noChangeAspect="1"/>
-                    </ns4:cNvPicPr>
-                  </ns4:nvPicPr>
-                  <ns4:blipFill>
-                    <ns3:blip r:embed="rId68"/>
-                    <ns3:stretch>
-                      <ns3:fillRect/>
-                    </ns3:stretch>
-                  </ns4:blipFill>
-                  <ns4:spPr bwMode="auto">
-                    <ns3:xfrm>
-                      <ns3:off x="0" y="0"/>
-                      <ns3:ext cx="5334000" cy="3983007"/>
-                    </ns3:xfrm>
-                    <ns3:prstGeom prst="rect">
-                      <ns3:avLst/>
-                    </ns3:prstGeom>
-                    <ns3:noFill/>
-                    <ns3:ln w="9525">
-                      <ns3:noFill/>
-                      <ns3:headEnd/>
-                      <ns3:tailEnd/>
-                    </ns3:ln>
-                  </ns4:spPr>
-                </ns4:pic>
-              </ns3:graphicData>
-            </ns3:graphic>
+            <wp:docPr descr="Acceso Exitoso Web Client" title="" id="67" name="Picture"/>
+            <ns2:graphic>
+              <ns2:graphicData uri="http://schemas.openxmlformats.org/drawingml/2006/picture">
+                <ns3:pic>
+                  <ns3:nvPicPr>
+                    <ns3:cNvPr descr="images/11_remoteapp_webclient_test.png" id="68" name="Picture"/>
+                    <ns3:cNvPicPr>
+                      <ns2:picLocks noChangeArrowheads="1" noChangeAspect="1"/>
+                    </ns3:cNvPicPr>
+                  </ns3:nvPicPr>
+                  <ns3:blipFill>
+                    <ns2:blip r:embed="rId66"/>
+                    <ns2:stretch>
+                      <ns2:fillRect/>
+                    </ns2:stretch>
+                  </ns3:blipFill>
+                  <ns3:spPr bwMode="auto">
+                    <ns2:xfrm>
+                      <ns2:off x="0" y="0"/>
+                      <ns2:ext cx="5334000" cy="3983007"/>
+                    </ns2:xfrm>
+                    <ns2:prstGeom prst="rect">
+                      <ns2:avLst/>
+                    </ns2:prstGeom>
+                    <ns2:noFill/>
+                    <ns2:ln w="9525">
+                      <ns2:noFill/>
+                      <ns2:headEnd/>
+                      <ns2:tailEnd/>
+                    </ns2:ln>
+                  </ns3:spPr>
+                </ns3:pic>
+              </ns2:graphicData>
+            </ns2:graphic>
           </wp:inline>
         </w:drawing>
       </w:r>
@@ -4920,8 +4910,8 @@
         <w:t xml:space="preserve">Figura 11.1: Portal intranet cargado de forma responsiva directamente en la pestaña del navegador cliente</w:t>
       </w:r>
     </w:p>
-    <w:bookmarkEnd w:id="71"/>
-    <w:bookmarkStart w:id="75" w:name="Xe66d9c8e08f492b8cf5791ec710e172a7301b92"/>
+    <w:bookmarkEnd w:id="69"/>
+    <w:bookmarkStart w:id="73" w:name="Xe66d9c8e08f492b8cf5791ec710e172a7301b92"/>
     <w:p>
       <w:pPr>
         <w:pStyle w:val="Heading3"/>
@@ -5081,40 +5071,40 @@
           <wp:inline>
             <wp:extent cx="5334000" cy="1009135"/>
             <wp:effectExtent b="0" l="0" r="0" t="0"/>
-            <wp:docPr descr="Prueba SSH Nivel 15" title="" id="73" name="Picture"/>
-            <ns3:graphic>
-              <ns3:graphicData uri="http://schemas.openxmlformats.org/drawingml/2006/picture">
-                <ns4:pic>
-                  <ns4:nvPicPr>
-                    <ns4:cNvPr descr="images/12_ssh_level15_test.png" id="74" name="Picture"/>
-                    <ns4:cNvPicPr>
-                      <ns3:picLocks noChangeArrowheads="1" noChangeAspect="1"/>
-                    </ns4:cNvPicPr>
-                  </ns4:nvPicPr>
-                  <ns4:blipFill>
-                    <ns3:blip r:embed="rId72"/>
-                    <ns3:stretch>
-                      <ns3:fillRect/>
-                    </ns3:stretch>
-                  </ns4:blipFill>
-                  <ns4:spPr bwMode="auto">
-                    <ns3:xfrm>
-                      <ns3:off x="0" y="0"/>
-                      <ns3:ext cx="5334000" cy="1009135"/>
-                    </ns3:xfrm>
-                    <ns3:prstGeom prst="rect">
-                      <ns3:avLst/>
-                    </ns3:prstGeom>
-                    <ns3:noFill/>
-                    <ns3:ln w="9525">
-                      <ns3:noFill/>
-                      <ns3:headEnd/>
-                      <ns3:tailEnd/>
-                    </ns3:ln>
-                  </ns4:spPr>
-                </ns4:pic>
-              </ns3:graphicData>
-            </ns3:graphic>
+            <wp:docPr descr="Prueba SSH Nivel 15" title="" id="71" name="Picture"/>
+            <ns2:graphic>
+              <ns2:graphicData uri="http://schemas.openxmlformats.org/drawingml/2006/picture">
+                <ns3:pic>
+                  <ns3:nvPicPr>
+                    <ns3:cNvPr descr="images/12_ssh_level15_test.png" id="72" name="Picture"/>
+                    <ns3:cNvPicPr>
+                      <ns2:picLocks noChangeArrowheads="1" noChangeAspect="1"/>
+                    </ns3:cNvPicPr>
+                  </ns3:nvPicPr>
+                  <ns3:blipFill>
+                    <ns2:blip r:embed="rId70"/>
+                    <ns2:stretch>
+                      <ns2:fillRect/>
+                    </ns2:stretch>
+                  </ns3:blipFill>
+                  <ns3:spPr bwMode="auto">
+                    <ns2:xfrm>
+                      <ns2:off x="0" y="0"/>
+                      <ns2:ext cx="5334000" cy="1009135"/>
+                    </ns2:xfrm>
+                    <ns2:prstGeom prst="rect">
+                      <ns2:avLst/>
+                    </ns2:prstGeom>
+                    <ns2:noFill/>
+                    <ns2:ln w="9525">
+                      <ns2:noFill/>
+                      <ns2:headEnd/>
+                      <ns2:tailEnd/>
+                    </ns2:ln>
+                  </ns3:spPr>
+                </ns3:pic>
+              </ns2:graphicData>
+            </ns2:graphic>
           </wp:inline>
         </w:drawing>
       </w:r>
@@ -5139,8 +5129,8 @@
         <w:t xml:space="preserve">Figura 12: Acceso SSH exitoso y verificación de obtención inmediata de nivel de privilegio 15</w:t>
       </w:r>
     </w:p>
-    <w:bookmarkEnd w:id="75"/>
-    <w:bookmarkStart w:id="79" w:name="X941fe909cbfd7694abcde3ba1e5eb6dcbd24fb8"/>
+    <w:bookmarkEnd w:id="73"/>
+    <w:bookmarkStart w:id="77" w:name="X941fe909cbfd7694abcde3ba1e5eb6dcbd24fb8"/>
     <w:p>
       <w:pPr>
         <w:pStyle w:val="Heading3"/>
@@ -5297,40 +5287,40 @@
           <wp:inline>
             <wp:extent cx="5334000" cy="1151786"/>
             <wp:effectExtent b="0" l="0" r="0" t="0"/>
-            <wp:docPr descr="Prueba SSH Nivel 1" title="" id="77" name="Picture"/>
-            <ns3:graphic>
-              <ns3:graphicData uri="http://schemas.openxmlformats.org/drawingml/2006/picture">
-                <ns4:pic>
-                  <ns4:nvPicPr>
-                    <ns4:cNvPr descr="images/13_ssh_level1_test.png" id="78" name="Picture"/>
-                    <ns4:cNvPicPr>
-                      <ns3:picLocks noChangeArrowheads="1" noChangeAspect="1"/>
-                    </ns4:cNvPicPr>
-                  </ns4:nvPicPr>
-                  <ns4:blipFill>
-                    <ns3:blip r:embed="rId76"/>
-                    <ns3:stretch>
-                      <ns3:fillRect/>
-                    </ns3:stretch>
-                  </ns4:blipFill>
-                  <ns4:spPr bwMode="auto">
-                    <ns3:xfrm>
-                      <ns3:off x="0" y="0"/>
-                      <ns3:ext cx="5334000" cy="1151786"/>
-                    </ns3:xfrm>
-                    <ns3:prstGeom prst="rect">
-                      <ns3:avLst/>
-                    </ns3:prstGeom>
-                    <ns3:noFill/>
-                    <ns3:ln w="9525">
-                      <ns3:noFill/>
-                      <ns3:headEnd/>
-                      <ns3:tailEnd/>
-                    </ns3:ln>
-                  </ns4:spPr>
-                </ns4:pic>
-              </ns3:graphicData>
-            </ns3:graphic>
+            <wp:docPr descr="Prueba SSH Nivel 1" title="" id="75" name="Picture"/>
+            <ns2:graphic>
+              <ns2:graphicData uri="http://schemas.openxmlformats.org/drawingml/2006/picture">
+                <ns3:pic>
+                  <ns3:nvPicPr>
+                    <ns3:cNvPr descr="images/13_ssh_level1_test.png" id="76" name="Picture"/>
+                    <ns3:cNvPicPr>
+                      <ns2:picLocks noChangeArrowheads="1" noChangeAspect="1"/>
+                    </ns3:cNvPicPr>
+                  </ns3:nvPicPr>
+                  <ns3:blipFill>
+                    <ns2:blip r:embed="rId74"/>
+                    <ns2:stretch>
+                      <ns2:fillRect/>
+                    </ns2:stretch>
+                  </ns3:blipFill>
+                  <ns3:spPr bwMode="auto">
+                    <ns2:xfrm>
+                      <ns2:off x="0" y="0"/>
+                      <ns2:ext cx="5334000" cy="1151786"/>
+                    </ns2:xfrm>
+                    <ns2:prstGeom prst="rect">
+                      <ns2:avLst/>
+                    </ns2:prstGeom>
+                    <ns2:noFill/>
+                    <ns2:ln w="9525">
+                      <ns2:noFill/>
+                      <ns2:headEnd/>
+                      <ns2:tailEnd/>
+                    </ns2:ln>
+                  </ns3:spPr>
+                </ns3:pic>
+              </ns2:graphicData>
+            </ns2:graphic>
           </wp:inline>
         </w:drawing>
       </w:r>
@@ -5355,8 +5345,8 @@
         <w:t xml:space="preserve">Figura 13: Comprobación de restricción de permisos a Nivel de Privilegio 1 para usuarios operadores</w:t>
       </w:r>
     </w:p>
-    <w:bookmarkEnd w:id="79"/>
-    <w:bookmarkStart w:id="89" w:name="X5d1ca89e9e7a3033d8723bde6054950536c3694"/>
+    <w:bookmarkEnd w:id="77"/>
+    <w:bookmarkStart w:id="87" w:name="X5d1ca89e9e7a3033d8723bde6054950536c3694"/>
     <w:p>
       <w:pPr>
         <w:pStyle w:val="Heading3"/>
@@ -5375,7 +5365,7 @@
         <w:t xml:space="preserve">Para verificar y diagnosticar el flujo de peticiones AAA y RADIUS desde la CLI del Router Cisco, se ejecutan los comandos de depuración solicitados.</w:t>
       </w:r>
     </w:p>
-    <w:bookmarkStart w:id="80" w:name="activar-debugging-en-el-router"/>
+    <w:bookmarkStart w:id="78" w:name="activar-debugging-en-el-router"/>
     <w:p>
       <w:pPr>
         <w:pStyle w:val="Heading4"/>
@@ -5415,8 +5405,8 @@
         <w:t xml:space="preserve">debug radius</w:t>
       </w:r>
     </w:p>
-    <w:bookmarkEnd w:id="80"/>
-    <w:bookmarkStart w:id="81" w:name="X1b9df0f3893772db2a6ee486f315fddca7698f5"/>
+    <w:bookmarkEnd w:id="78"/>
+    <w:bookmarkStart w:id="79" w:name="X1b9df0f3893772db2a6ee486f315fddca7698f5"/>
     <w:p>
       <w:pPr>
         <w:pStyle w:val="Heading4"/>
@@ -5518,8 +5508,8 @@
         <w:t xml:space="preserve">*Jul 10 04:45:12.134: AAA/AUTHOR/EXEC: Privilege level 15 mapped from RADIUS VSA</w:t>
       </w:r>
     </w:p>
-    <w:bookmarkEnd w:id="81"/>
-    <w:bookmarkStart w:id="88" w:name="comandos-de-monitoreo-y-auditoría"/>
+    <w:bookmarkEnd w:id="79"/>
+    <w:bookmarkStart w:id="86" w:name="comandos-de-monitoreo-y-auditoría"/>
     <w:p>
       <w:pPr>
         <w:pStyle w:val="Heading4"/>
@@ -5603,40 +5593,40 @@
           <wp:inline>
             <wp:extent cx="5334000" cy="4432845"/>
             <wp:effectExtent b="0" l="0" r="0" t="0"/>
-            <wp:docPr descr="Debugs de RADIUS en Router" title="" id="83" name="Picture"/>
-            <ns3:graphic>
-              <ns3:graphicData uri="http://schemas.openxmlformats.org/drawingml/2006/picture">
-                <ns4:pic>
-                  <ns4:nvPicPr>
-                    <ns4:cNvPr descr="images/14_cisco_aaa_debug_logs.png" id="84" name="Picture"/>
-                    <ns4:cNvPicPr>
-                      <ns3:picLocks noChangeArrowheads="1" noChangeAspect="1"/>
-                    </ns4:cNvPicPr>
-                  </ns4:nvPicPr>
-                  <ns4:blipFill>
-                    <ns3:blip r:embed="rId82"/>
-                    <ns3:stretch>
-                      <ns3:fillRect/>
-                    </ns3:stretch>
-                  </ns4:blipFill>
-                  <ns4:spPr bwMode="auto">
-                    <ns3:xfrm>
-                      <ns3:off x="0" y="0"/>
-                      <ns3:ext cx="5334000" cy="4432845"/>
-                    </ns3:xfrm>
-                    <ns3:prstGeom prst="rect">
-                      <ns3:avLst/>
-                    </ns3:prstGeom>
-                    <ns3:noFill/>
-                    <ns3:ln w="9525">
-                      <ns3:noFill/>
-                      <ns3:headEnd/>
-                      <ns3:tailEnd/>
-                    </ns3:ln>
-                  </ns4:spPr>
-                </ns4:pic>
-              </ns3:graphicData>
-            </ns3:graphic>
+            <wp:docPr descr="Debugs de RADIUS en Router" title="" id="81" name="Picture"/>
+            <ns2:graphic>
+              <ns2:graphicData uri="http://schemas.openxmlformats.org/drawingml/2006/picture">
+                <ns3:pic>
+                  <ns3:nvPicPr>
+                    <ns3:cNvPr descr="images/14_cisco_aaa_debug_logs.png" id="82" name="Picture"/>
+                    <ns3:cNvPicPr>
+                      <ns2:picLocks noChangeArrowheads="1" noChangeAspect="1"/>
+                    </ns3:cNvPicPr>
+                  </ns3:nvPicPr>
+                  <ns3:blipFill>
+                    <ns2:blip r:embed="rId80"/>
+                    <ns2:stretch>
+                      <ns2:fillRect/>
+                    </ns2:stretch>
+                  </ns3:blipFill>
+                  <ns3:spPr bwMode="auto">
+                    <ns2:xfrm>
+                      <ns2:off x="0" y="0"/>
+                      <ns2:ext cx="5334000" cy="4432845"/>
+                    </ns2:xfrm>
+                    <ns2:prstGeom prst="rect">
+                      <ns2:avLst/>
+                    </ns2:prstGeom>
+                    <ns2:noFill/>
+                    <ns2:ln w="9525">
+                      <ns2:noFill/>
+                      <ns2:headEnd/>
+                      <ns2:tailEnd/>
+                    </ns2:ln>
+                  </ns3:spPr>
+                </ns3:pic>
+              </ns2:graphicData>
+            </ns2:graphic>
           </wp:inline>
         </w:drawing>
       </w:r>
@@ -5672,40 +5662,40 @@
           <wp:inline>
             <wp:extent cx="5334000" cy="4419197"/>
             <wp:effectExtent b="0" l="0" r="0" t="0"/>
-            <wp:docPr descr="AAA Servers Status" title="" id="86" name="Picture"/>
-            <ns3:graphic>
-              <ns3:graphicData uri="http://schemas.openxmlformats.org/drawingml/2006/picture">
-                <ns4:pic>
-                  <ns4:nvPicPr>
-                    <ns4:cNvPr descr="images/14_cisco_aaa_servers.png" id="87" name="Picture"/>
-                    <ns4:cNvPicPr>
-                      <ns3:picLocks noChangeArrowheads="1" noChangeAspect="1"/>
-                    </ns4:cNvPicPr>
-                  </ns4:nvPicPr>
-                  <ns4:blipFill>
-                    <ns3:blip r:embed="rId85"/>
-                    <ns3:stretch>
-                      <ns3:fillRect/>
-                    </ns3:stretch>
-                  </ns4:blipFill>
-                  <ns4:spPr bwMode="auto">
-                    <ns3:xfrm>
-                      <ns3:off x="0" y="0"/>
-                      <ns3:ext cx="5334000" cy="4419197"/>
-                    </ns3:xfrm>
-                    <ns3:prstGeom prst="rect">
-                      <ns3:avLst/>
-                    </ns3:prstGeom>
-                    <ns3:noFill/>
-                    <ns3:ln w="9525">
-                      <ns3:noFill/>
-                      <ns3:headEnd/>
-                      <ns3:tailEnd/>
-                    </ns3:ln>
-                  </ns4:spPr>
-                </ns4:pic>
-              </ns3:graphicData>
-            </ns3:graphic>
+            <wp:docPr descr="AAA Servers Status" title="" id="84" name="Picture"/>
+            <ns2:graphic>
+              <ns2:graphicData uri="http://schemas.openxmlformats.org/drawingml/2006/picture">
+                <ns3:pic>
+                  <ns3:nvPicPr>
+                    <ns3:cNvPr descr="images/14_cisco_aaa_servers.png" id="85" name="Picture"/>
+                    <ns3:cNvPicPr>
+                      <ns2:picLocks noChangeArrowheads="1" noChangeAspect="1"/>
+                    </ns3:cNvPicPr>
+                  </ns3:nvPicPr>
+                  <ns3:blipFill>
+                    <ns2:blip r:embed="rId83"/>
+                    <ns2:stretch>
+                      <ns2:fillRect/>
+                    </ns2:stretch>
+                  </ns3:blipFill>
+                  <ns3:spPr bwMode="auto">
+                    <ns2:xfrm>
+                      <ns2:off x="0" y="0"/>
+                      <ns2:ext cx="5334000" cy="4419197"/>
+                    </ns2:xfrm>
+                    <ns2:prstGeom prst="rect">
+                      <ns2:avLst/>
+                    </ns2:prstGeom>
+                    <ns2:noFill/>
+                    <ns2:ln w="9525">
+                      <ns2:noFill/>
+                      <ns2:headEnd/>
+                      <ns2:tailEnd/>
+                    </ns2:ln>
+                  </ns3:spPr>
+                </ns3:pic>
+              </ns2:graphicData>
+            </ns2:graphic>
           </wp:inline>
         </w:drawing>
       </w:r>
@@ -5730,10 +5720,10 @@
         <w:t xml:space="preserve">Figura 14.1: Salidas de comandos show aaa servers (estado UP de NPS) y show aaa sessions (usuario ARD conectado)</w:t>
       </w:r>
     </w:p>
+    <w:bookmarkEnd w:id="86"/>
+    <w:bookmarkEnd w:id="87"/>
     <w:bookmarkEnd w:id="88"/>
-    <w:bookmarkEnd w:id="89"/>
-    <w:bookmarkEnd w:id="90"/>
-    <w:bookmarkStart w:id="91" w:name="conclusión"/>
+    <w:bookmarkStart w:id="89" w:name="conclusión"/>
     <w:p>
       <w:pPr>
         <w:pStyle w:val="Heading2"/>
@@ -5752,8 +5742,8 @@
         <w:t xml:space="preserve">La realización de este laboratorio comprueba los beneficios de integrar tecnologías de virtualización de servicios con sistemas de control de acceso basados en la red. RemoteApp y su contraparte Web Client resuelven la disponibilidad de herramientas y portales del negocio (como la intranet IIS) desde cualquier ubicación sin comprometer la seguridad física de los servidores. Por su parte, la combinación de RADIUS (NPS) con AAA en la electrónica de red de Cisco facilita una gestión eficiente de los accesos administrativos, eliminando la necesidad de contraseñas locales idénticas compartidas en múltiples dispositivos y reduciendo la superficie de ataque del entorno tecnológico.</w:t>
       </w:r>
     </w:p>
-    <w:bookmarkEnd w:id="91"/>
-    <w:bookmarkEnd w:id="92"/>
+    <w:bookmarkEnd w:id="89"/>
+    <w:bookmarkEnd w:id="90"/>
     <w:sectPr>
       <w:footnotePr>
         <w:numRestart w:val="eachSect"/>

</xml_diff>

<commit_message>
Aplicar paginación dinámica y divisiones correctas
</commit_message>
<xml_diff>
--- a/AlanGarcia_2025-1403_Laboratorio_RemoteApp_RADIUS.docx
+++ b/AlanGarcia_2025-1403_Laboratorio_RemoteApp_RADIUS.docx
@@ -149,11 +149,6 @@
       </w:r>
       <w:r>
         <w:t xml:space="preserve">https://github.com/imAlanG16/TSI-203_Semana_9_RemoteApp_RADIUS</w:t>
-      </w:r>
-    </w:p>
-    <w:p>
-      <w:r>
-        <w:br w:type="page"/>
       </w:r>
     </w:p>
     <w:bookmarkStart w:id="9" w:name="introducción"/>

</xml_diff>